<commit_message>
add 借书卡 to 图书项目 as a subcategory
</commit_message>
<xml_diff>
--- a/readme.docx
+++ b/readme.docx
@@ -3682,7 +3682,16 @@
         <w:t>y</w:t>
       </w:r>
       <w:r>
-        <w:t>annonghuang@icloud.com / 142536</w:t>
+        <w:t xml:space="preserve">annonghuang@icloud.com / </w:t>
+      </w:r>
+      <w:r>
+        <w:t xml:space="preserve">jing-9193 (old: </w:t>
+      </w:r>
+      <w:r>
+        <w:t>142536</w:t>
+      </w:r>
+      <w:r>
+        <w:t>, changed 3/15/2026)</w:t>
       </w:r>
     </w:p>
     <w:p>
@@ -3857,19 +3866,7 @@
         <w:rPr>
           <w:u w:val="single"/>
         </w:rPr>
-        <w:t xml:space="preserve">Option </w:t>
-      </w:r>
-      <w:r>
-        <w:rPr>
-          <w:u w:val="single"/>
-        </w:rPr>
-        <w:t>2</w:t>
-      </w:r>
-      <w:r>
-        <w:rPr>
-          <w:u w:val="single"/>
-        </w:rPr>
-        <w:t>:</w:t>
+        <w:t>Option 2:</w:t>
       </w:r>
     </w:p>
     <w:p/>

</xml_diff>